<commit_message>
Confirmacion, comunicación y éxito. Usuario y Stripe
</commit_message>
<xml_diff>
--- a/gestor_reservas_frontend/frontend_documentacion/15. Actualizo MyReservations desde user.docx
+++ b/gestor_reservas_frontend/frontend_documentacion/15. Actualizo MyReservations desde user.docx
@@ -1204,6 +1204,149 @@
                     <a:xfrm>
                       <a:off x="0" y="0"/>
                       <a:ext cx="5400040" cy="1071880"/>
+                    </a:xfrm>
+                    <a:prstGeom prst="rect">
+                      <a:avLst/>
+                    </a:prstGeom>
+                  </pic:spPr>
+                </pic:pic>
+              </a:graphicData>
+            </a:graphic>
+          </wp:inline>
+        </w:drawing>
+      </w:r>
+    </w:p>
+    <w:p>
+      <w:r>
+        <w:t>Lo añado a la rama principal</w:t>
+      </w:r>
+    </w:p>
+    <w:p>
+      <w:r>
+        <w:drawing>
+          <wp:inline distT="0" distB="0" distL="0" distR="0" wp14:anchorId="4F13E9FC" wp14:editId="410A4A10">
+            <wp:extent cx="5400040" cy="113030"/>
+            <wp:effectExtent l="0" t="0" r="0" b="1270"/>
+            <wp:docPr id="1501775106" name="Imagen 1"/>
+            <wp:cNvGraphicFramePr>
+              <a:graphicFrameLocks xmlns:a="http://schemas.openxmlformats.org/drawingml/2006/main" noChangeAspect="1"/>
+            </wp:cNvGraphicFramePr>
+            <a:graphic xmlns:a="http://schemas.openxmlformats.org/drawingml/2006/main">
+              <a:graphicData uri="http://schemas.openxmlformats.org/drawingml/2006/picture">
+                <pic:pic xmlns:pic="http://schemas.openxmlformats.org/drawingml/2006/picture">
+                  <pic:nvPicPr>
+                    <pic:cNvPr id="1501775106" name=""/>
+                    <pic:cNvPicPr/>
+                  </pic:nvPicPr>
+                  <pic:blipFill>
+                    <a:blip r:embed="rId23"/>
+                    <a:stretch>
+                      <a:fillRect/>
+                    </a:stretch>
+                  </pic:blipFill>
+                  <pic:spPr>
+                    <a:xfrm>
+                      <a:off x="0" y="0"/>
+                      <a:ext cx="5400040" cy="113030"/>
+                    </a:xfrm>
+                    <a:prstGeom prst="rect">
+                      <a:avLst/>
+                    </a:prstGeom>
+                  </pic:spPr>
+                </pic:pic>
+              </a:graphicData>
+            </a:graphic>
+          </wp:inline>
+        </w:drawing>
+      </w:r>
+    </w:p>
+    <w:p>
+      <w:r>
+        <w:t xml:space="preserve">Lo añado a </w:t>
+      </w:r>
+      <w:proofErr w:type="spellStart"/>
+      <w:r>
+        <w:t>git</w:t>
+      </w:r>
+      <w:proofErr w:type="spellEnd"/>
+    </w:p>
+    <w:p>
+      <w:r>
+        <w:drawing>
+          <wp:inline distT="0" distB="0" distL="0" distR="0" wp14:anchorId="434EB8B8" wp14:editId="3F267193">
+            <wp:extent cx="5400040" cy="532130"/>
+            <wp:effectExtent l="0" t="0" r="0" b="1270"/>
+            <wp:docPr id="903811680" name="Imagen 1"/>
+            <wp:cNvGraphicFramePr>
+              <a:graphicFrameLocks xmlns:a="http://schemas.openxmlformats.org/drawingml/2006/main" noChangeAspect="1"/>
+            </wp:cNvGraphicFramePr>
+            <a:graphic xmlns:a="http://schemas.openxmlformats.org/drawingml/2006/main">
+              <a:graphicData uri="http://schemas.openxmlformats.org/drawingml/2006/picture">
+                <pic:pic xmlns:pic="http://schemas.openxmlformats.org/drawingml/2006/picture">
+                  <pic:nvPicPr>
+                    <pic:cNvPr id="903811680" name=""/>
+                    <pic:cNvPicPr/>
+                  </pic:nvPicPr>
+                  <pic:blipFill>
+                    <a:blip r:embed="rId24"/>
+                    <a:stretch>
+                      <a:fillRect/>
+                    </a:stretch>
+                  </pic:blipFill>
+                  <pic:spPr>
+                    <a:xfrm>
+                      <a:off x="0" y="0"/>
+                      <a:ext cx="5400040" cy="532130"/>
+                    </a:xfrm>
+                    <a:prstGeom prst="rect">
+                      <a:avLst/>
+                    </a:prstGeom>
+                  </pic:spPr>
+                </pic:pic>
+              </a:graphicData>
+            </a:graphic>
+          </wp:inline>
+        </w:drawing>
+      </w:r>
+    </w:p>
+    <w:p>
+      <w:r>
+        <w:t xml:space="preserve">Añado el </w:t>
+      </w:r>
+      <w:proofErr w:type="spellStart"/>
+      <w:r>
+        <w:t>commit</w:t>
+      </w:r>
+      <w:proofErr w:type="spellEnd"/>
+    </w:p>
+    <w:p>
+      <w:r>
+        <w:lastRenderedPageBreak/>
+        <w:drawing>
+          <wp:inline distT="0" distB="0" distL="0" distR="0" wp14:anchorId="232DFCE2" wp14:editId="48180D0B">
+            <wp:extent cx="5400040" cy="1056005"/>
+            <wp:effectExtent l="0" t="0" r="0" b="0"/>
+            <wp:docPr id="1610799572" name="Imagen 1" descr="Texto&#10;&#10;El contenido generado por IA puede ser incorrecto."/>
+            <wp:cNvGraphicFramePr>
+              <a:graphicFrameLocks xmlns:a="http://schemas.openxmlformats.org/drawingml/2006/main" noChangeAspect="1"/>
+            </wp:cNvGraphicFramePr>
+            <a:graphic xmlns:a="http://schemas.openxmlformats.org/drawingml/2006/main">
+              <a:graphicData uri="http://schemas.openxmlformats.org/drawingml/2006/picture">
+                <pic:pic xmlns:pic="http://schemas.openxmlformats.org/drawingml/2006/picture">
+                  <pic:nvPicPr>
+                    <pic:cNvPr id="1610799572" name="Imagen 1" descr="Texto&#10;&#10;El contenido generado por IA puede ser incorrecto."/>
+                    <pic:cNvPicPr/>
+                  </pic:nvPicPr>
+                  <pic:blipFill>
+                    <a:blip r:embed="rId25"/>
+                    <a:stretch>
+                      <a:fillRect/>
+                    </a:stretch>
+                  </pic:blipFill>
+                  <pic:spPr>
+                    <a:xfrm>
+                      <a:off x="0" y="0"/>
+                      <a:ext cx="5400040" cy="1056005"/>
                     </a:xfrm>
                     <a:prstGeom prst="rect">
                       <a:avLst/>

</xml_diff>